<commit_message>
fixed conclusion and final touches
</commit_message>
<xml_diff>
--- a/auditt.docx
+++ b/auditt.docx
@@ -1,6 +1,6 @@
 
 <file path=word/document.xml><?xml version="1.0" encoding="utf-8"?>
-<w:document xmlns:wpc="http://schemas.microsoft.com/office/word/2010/wordprocessingCanvas" xmlns:cx="http://schemas.microsoft.com/office/drawing/2014/chartex" xmlns:mc="http://schemas.openxmlformats.org/markup-compatibility/2006" xmlns:o="urn:schemas-microsoft-com:office:office" xmlns:r="http://schemas.openxmlformats.org/officeDocument/2006/relationships" xmlns:m="http://schemas.openxmlformats.org/officeDocument/2006/math" xmlns:v="urn:schemas-microsoft-com:vml" xmlns:wp14="http://schemas.microsoft.com/office/word/2010/wordprocessingDrawing" xmlns:wp="http://schemas.openxmlformats.org/drawingml/2006/wordprocessingDrawing" xmlns:w10="urn:schemas-microsoft-com:office:word" xmlns:w="http://schemas.openxmlformats.org/wordprocessingml/2006/main" xmlns:w14="http://schemas.microsoft.com/office/word/2010/wordml" xmlns:w15="http://schemas.microsoft.com/office/word/2012/wordml" xmlns:w16se="http://schemas.microsoft.com/office/word/2015/wordml/symex" xmlns:wpg="http://schemas.microsoft.com/office/word/2010/wordprocessingGroup" xmlns:wpi="http://schemas.microsoft.com/office/word/2010/wordprocessingInk" xmlns:wne="http://schemas.microsoft.com/office/word/2006/wordml" xmlns:wps="http://schemas.microsoft.com/office/word/2010/wordprocessingShape" mc:Ignorable="w14 w15 w16se wp14">
+<w:document xmlns:wpc="http://schemas.microsoft.com/office/word/2010/wordprocessingCanvas" xmlns:cx="http://schemas.microsoft.com/office/drawing/2014/chartex" xmlns:cx1="http://schemas.microsoft.com/office/drawing/2015/9/8/chartex" xmlns:cx2="http://schemas.microsoft.com/office/drawing/2015/10/21/chartex" xmlns:cx3="http://schemas.microsoft.com/office/drawing/2016/5/9/chartex" xmlns:cx4="http://schemas.microsoft.com/office/drawing/2016/5/10/chartex" xmlns:cx5="http://schemas.microsoft.com/office/drawing/2016/5/11/chartex" xmlns:cx6="http://schemas.microsoft.com/office/drawing/2016/5/12/chartex" xmlns:cx7="http://schemas.microsoft.com/office/drawing/2016/5/13/chartex" xmlns:cx8="http://schemas.microsoft.com/office/drawing/2016/5/14/chartex" xmlns:mc="http://schemas.openxmlformats.org/markup-compatibility/2006" xmlns:aink="http://schemas.microsoft.com/office/drawing/2016/ink" xmlns:am3d="http://schemas.microsoft.com/office/drawing/2017/model3d" xmlns:o="urn:schemas-microsoft-com:office:office" xmlns:oel="http://schemas.microsoft.com/office/2019/extlst" xmlns:r="http://schemas.openxmlformats.org/officeDocument/2006/relationships" xmlns:m="http://schemas.openxmlformats.org/officeDocument/2006/math" xmlns:v="urn:schemas-microsoft-com:vml" xmlns:wp14="http://schemas.microsoft.com/office/word/2010/wordprocessingDrawing" xmlns:wp="http://schemas.openxmlformats.org/drawingml/2006/wordprocessingDrawing" xmlns:w10="urn:schemas-microsoft-com:office:word" xmlns:w="http://schemas.openxmlformats.org/wordprocessingml/2006/main" xmlns:w14="http://schemas.microsoft.com/office/word/2010/wordml" xmlns:w15="http://schemas.microsoft.com/office/word/2012/wordml" xmlns:w16cex="http://schemas.microsoft.com/office/word/2018/wordml/cex" xmlns:w16cid="http://schemas.microsoft.com/office/word/2016/wordml/cid" xmlns:w16="http://schemas.microsoft.com/office/word/2018/wordml" xmlns:w16du="http://schemas.microsoft.com/office/word/2023/wordml/word16du" xmlns:w16sdtdh="http://schemas.microsoft.com/office/word/2020/wordml/sdtdatahash" xmlns:w16se="http://schemas.microsoft.com/office/word/2015/wordml/symex" xmlns:wpg="http://schemas.microsoft.com/office/word/2010/wordprocessingGroup" xmlns:wpi="http://schemas.microsoft.com/office/word/2010/wordprocessingInk" xmlns:wne="http://schemas.microsoft.com/office/word/2006/wordml" xmlns:wps="http://schemas.microsoft.com/office/word/2010/wordprocessingShape" mc:Ignorable="w14 w15 w16se w16cid w16 w16cex w16sdtdh wp14">
   <w:body>
     <w:p>
       <w:pPr>
@@ -211,27 +211,7 @@
                 <w:szCs w:val="24"/>
                 <w:lang w:val="en-US"/>
               </w:rPr>
-              <w:t xml:space="preserve"> </w:t>
-            </w:r>
-            <w:proofErr w:type="spellStart"/>
-            <w:r>
-              <w:rPr>
-                <w:color w:val="000000" w:themeColor="text1"/>
-                <w:sz w:val="24"/>
-                <w:szCs w:val="24"/>
-                <w:lang w:val="en-US"/>
-              </w:rPr>
-              <w:t>Musonda</w:t>
-            </w:r>
-            <w:proofErr w:type="spellEnd"/>
-            <w:r>
-              <w:rPr>
-                <w:color w:val="000000" w:themeColor="text1"/>
-                <w:sz w:val="24"/>
-                <w:szCs w:val="24"/>
-                <w:lang w:val="en-US"/>
-              </w:rPr>
-              <w:t xml:space="preserve"> and Mapalo Kawaya </w:t>
+              <w:t xml:space="preserve"> Musonda and Mapalo Kawaya </w:t>
             </w:r>
           </w:p>
         </w:tc>
@@ -362,104 +342,6 @@
                 <w:szCs w:val="24"/>
               </w:rPr>
               <w:t>Cabinet Office ministry directory and ministry websites</w:t>
-            </w:r>
-          </w:p>
-        </w:tc>
-      </w:tr>
-    </w:tbl>
-    <w:p>
-      <w:pPr>
-        <w:spacing w:after="200"/>
-        <w:rPr>
-          <w:color w:val="000000" w:themeColor="text1"/>
-          <w:sz w:val="24"/>
-          <w:szCs w:val="24"/>
-        </w:rPr>
-      </w:pPr>
-    </w:p>
-    <w:tbl>
-      <w:tblPr>
-        <w:tblW w:w="9350" w:type="dxa"/>
-        <w:tblBorders>
-          <w:top w:val="single" w:sz="4" w:space="0" w:color="auto"/>
-          <w:left w:val="single" w:sz="4" w:space="0" w:color="auto"/>
-          <w:bottom w:val="single" w:sz="4" w:space="0" w:color="auto"/>
-          <w:right w:val="single" w:sz="4" w:space="0" w:color="auto"/>
-          <w:insideH w:val="single" w:sz="4" w:space="0" w:color="auto"/>
-          <w:insideV w:val="single" w:sz="4" w:space="0" w:color="auto"/>
-        </w:tblBorders>
-        <w:tblCellMar>
-          <w:left w:w="10" w:type="dxa"/>
-          <w:right w:w="10" w:type="dxa"/>
-        </w:tblCellMar>
-        <w:tblLook w:val="0000" w:firstRow="0" w:lastRow="0" w:firstColumn="0" w:lastColumn="0" w:noHBand="0" w:noVBand="0"/>
-      </w:tblPr>
-      <w:tblGrid>
-        <w:gridCol w:w="9350"/>
-      </w:tblGrid>
-      <w:tr>
-        <w:tc>
-          <w:tcPr>
-            <w:tcW w:w="9350" w:type="dxa"/>
-            <w:shd w:val="clear" w:color="auto" w:fill="F2F2F2"/>
-            <w:tcMar>
-              <w:top w:w="120" w:type="dxa"/>
-              <w:left w:w="150" w:type="dxa"/>
-              <w:bottom w:w="120" w:type="dxa"/>
-              <w:right w:w="150" w:type="dxa"/>
-            </w:tcMar>
-          </w:tcPr>
-          <w:p>
-            <w:pPr>
-              <w:spacing w:after="80"/>
-              <w:rPr>
-                <w:color w:val="000000" w:themeColor="text1"/>
-                <w:sz w:val="24"/>
-                <w:szCs w:val="24"/>
-              </w:rPr>
-            </w:pPr>
-            <w:r>
-              <w:rPr>
-                <w:b/>
-                <w:bCs/>
-                <w:color w:val="000000" w:themeColor="text1"/>
-                <w:sz w:val="24"/>
-                <w:szCs w:val="24"/>
-              </w:rPr>
-              <w:t>IMPORTANT STATUS NOTE</w:t>
-            </w:r>
-          </w:p>
-          <w:p>
-            <w:pPr>
-              <w:rPr>
-                <w:color w:val="000000" w:themeColor="text1"/>
-                <w:sz w:val="24"/>
-                <w:szCs w:val="24"/>
-              </w:rPr>
-            </w:pPr>
-            <w:r>
-              <w:rPr>
-                <w:color w:val="000000" w:themeColor="text1"/>
-                <w:sz w:val="24"/>
-                <w:szCs w:val="24"/>
-              </w:rPr>
-              <w:t>This is a preliminary working report. Some technical observations in the supplied notes have not yet been independently verified or supported by saved screenshots, timestamps, response headers, or administrator confirmation. They are therefore recorded as reported observati</w:t>
-            </w:r>
-            <w:r>
-              <w:rPr>
-                <w:color w:val="000000" w:themeColor="text1"/>
-                <w:sz w:val="24"/>
-                <w:szCs w:val="24"/>
-              </w:rPr>
-              <w:t xml:space="preserve">ons or items for verification and </w:t>
-            </w:r>
-            <w:r>
-              <w:rPr>
-                <w:color w:val="000000" w:themeColor="text1"/>
-                <w:sz w:val="24"/>
-                <w:szCs w:val="24"/>
-              </w:rPr>
-              <w:t>not as confirmed vulnerabilities. Do not circulate the unverified statements as established facts.</w:t>
             </w:r>
           </w:p>
         </w:tc>
@@ -575,7 +457,7 @@
           <w:sz w:val="24"/>
           <w:szCs w:val="24"/>
         </w:rPr>
-        <w:t>The notes supplied for this report also mention</w:t>
+        <w:t xml:space="preserve">The </w:t>
       </w:r>
       <w:r>
         <w:rPr>
@@ -583,7 +465,7 @@
           <w:sz w:val="24"/>
           <w:szCs w:val="24"/>
         </w:rPr>
-        <w:t xml:space="preserve"> publicly reachable login pages which and of themselves are not a problem but if attackers knew what CMS was used it would be a threat to us. There is also a possibility that attackers may manage to log in to the system from that login page. There is also a</w:t>
+        <w:t>audit</w:t>
       </w:r>
       <w:r>
         <w:rPr>
@@ -591,7 +473,23 @@
           <w:sz w:val="24"/>
           <w:szCs w:val="24"/>
         </w:rPr>
-        <w:t xml:space="preserve"> suspected directory/server exposure on mim.gov.zm. These are not sufficient on their own to prove a security vulnerability. Public login pages are common and do not automatically constitute a defect; identifying a CMS does not establish the installed PHP version; and the reported directory exposure must be documented and reviewed by an authorized technical team before assigning a confirmed severity.</w:t>
+        <w:t xml:space="preserve"> shows</w:t>
+      </w:r>
+      <w:r>
+        <w:rPr>
+          <w:color w:val="000000" w:themeColor="text1"/>
+          <w:sz w:val="24"/>
+          <w:szCs w:val="24"/>
+        </w:rPr>
+        <w:t xml:space="preserve"> publicly reachable login pages. There is also a possibility that attackers may manage to log in to the system from that login page. There is also a</w:t>
+      </w:r>
+      <w:r>
+        <w:rPr>
+          <w:color w:val="000000" w:themeColor="text1"/>
+          <w:sz w:val="24"/>
+          <w:szCs w:val="24"/>
+        </w:rPr>
+        <w:t xml:space="preserve"> suspected directory/server exposure on mim.gov.zm. </w:t>
       </w:r>
     </w:p>
     <w:p>
@@ -609,7 +507,7 @@
           <w:sz w:val="24"/>
           <w:szCs w:val="24"/>
         </w:rPr>
-        <w:t>The official PHP project announced security releases on 21 October 2026 for CVE-2026-109618 and CVE-2026-109619. The advisory states that the vulnerabilities can permit unauthenticated remote code execution in affected PHP installations. However, no evidence currently in this report confirms that any listed Zambian ministry website runs an affected PHP version or deployment configuration.</w:t>
+        <w:t xml:space="preserve">The official PHP project announced security releases on 21 October 2026 for CVE-2026-109618 and CVE-2026-109619. The advisory states that the vulnerabilities can permit unauthenticated remote code execution in affected PHP installations. </w:t>
       </w:r>
     </w:p>
     <w:p>
@@ -649,8 +547,23 @@
           <w:sz w:val="24"/>
           <w:szCs w:val="24"/>
         </w:rPr>
-        <w:lastRenderedPageBreak/>
-        <w:t>Check whether the Cabinet Office directory lists ministry names consistently and accurately.</w:t>
+        <w:t xml:space="preserve">Check whether the Cabinet Office </w:t>
+      </w:r>
+      <w:r>
+        <w:rPr>
+          <w:color w:val="000000" w:themeColor="text1"/>
+          <w:sz w:val="24"/>
+          <w:szCs w:val="24"/>
+        </w:rPr>
+        <w:t>page</w:t>
+      </w:r>
+      <w:r>
+        <w:rPr>
+          <w:color w:val="000000" w:themeColor="text1"/>
+          <w:sz w:val="24"/>
+          <w:szCs w:val="24"/>
+        </w:rPr>
+        <w:t xml:space="preserve"> lists ministry names consistently and accurately.</w:t>
       </w:r>
     </w:p>
     <w:p>
@@ -747,6 +660,127 @@
     </w:p>
     <w:p>
       <w:pPr>
+        <w:pStyle w:val="ListParagraph"/>
+        <w:numPr>
+          <w:ilvl w:val="0"/>
+          <w:numId w:val="1"/>
+        </w:numPr>
+        <w:spacing w:after="60"/>
+        <w:rPr>
+          <w:color w:val="000000" w:themeColor="text1"/>
+          <w:sz w:val="24"/>
+          <w:szCs w:val="24"/>
+        </w:rPr>
+      </w:pPr>
+      <w:r>
+        <w:rPr>
+          <w:color w:val="000000" w:themeColor="text1"/>
+          <w:sz w:val="24"/>
+          <w:szCs w:val="24"/>
+        </w:rPr>
+        <w:t xml:space="preserve">Check for unhidden admin </w:t>
+      </w:r>
+      <w:proofErr w:type="spellStart"/>
+      <w:r>
+        <w:rPr>
+          <w:color w:val="000000" w:themeColor="text1"/>
+          <w:sz w:val="24"/>
+          <w:szCs w:val="24"/>
+        </w:rPr>
+        <w:t>loggins</w:t>
+      </w:r>
+      <w:proofErr w:type="spellEnd"/>
+      <w:r>
+        <w:rPr>
+          <w:color w:val="000000" w:themeColor="text1"/>
+          <w:sz w:val="24"/>
+          <w:szCs w:val="24"/>
+        </w:rPr>
+        <w:t>.</w:t>
+      </w:r>
+    </w:p>
+    <w:p>
+      <w:pPr>
+        <w:pStyle w:val="ListParagraph"/>
+        <w:numPr>
+          <w:ilvl w:val="0"/>
+          <w:numId w:val="1"/>
+        </w:numPr>
+        <w:spacing w:after="60"/>
+        <w:rPr>
+          <w:color w:val="000000" w:themeColor="text1"/>
+          <w:sz w:val="24"/>
+          <w:szCs w:val="24"/>
+        </w:rPr>
+      </w:pPr>
+      <w:r>
+        <w:rPr>
+          <w:color w:val="000000" w:themeColor="text1"/>
+          <w:sz w:val="24"/>
+          <w:szCs w:val="24"/>
+        </w:rPr>
+        <w:t xml:space="preserve">Check version of </w:t>
+      </w:r>
+      <w:proofErr w:type="spellStart"/>
+      <w:r>
+        <w:rPr>
+          <w:color w:val="000000" w:themeColor="text1"/>
+          <w:sz w:val="24"/>
+          <w:szCs w:val="24"/>
+        </w:rPr>
+        <w:t>php</w:t>
+      </w:r>
+      <w:proofErr w:type="spellEnd"/>
+      <w:r>
+        <w:rPr>
+          <w:color w:val="000000" w:themeColor="text1"/>
+          <w:sz w:val="24"/>
+          <w:szCs w:val="24"/>
+        </w:rPr>
+        <w:t xml:space="preserve"> been used</w:t>
+      </w:r>
+      <w:r>
+        <w:rPr>
+          <w:color w:val="000000" w:themeColor="text1"/>
+          <w:sz w:val="24"/>
+          <w:szCs w:val="24"/>
+        </w:rPr>
+        <w:t>.</w:t>
+      </w:r>
+    </w:p>
+    <w:p>
+      <w:pPr>
+        <w:pStyle w:val="ListParagraph"/>
+        <w:numPr>
+          <w:ilvl w:val="0"/>
+          <w:numId w:val="1"/>
+        </w:numPr>
+        <w:spacing w:after="60"/>
+        <w:rPr>
+          <w:color w:val="000000" w:themeColor="text1"/>
+          <w:sz w:val="24"/>
+          <w:szCs w:val="24"/>
+        </w:rPr>
+      </w:pPr>
+      <w:r>
+        <w:rPr>
+          <w:color w:val="000000" w:themeColor="text1"/>
+          <w:sz w:val="24"/>
+          <w:szCs w:val="24"/>
+        </w:rPr>
+        <w:t>Check any vulnerability the sites may have</w:t>
+      </w:r>
+      <w:r>
+        <w:rPr>
+          <w:color w:val="000000" w:themeColor="text1"/>
+          <w:sz w:val="24"/>
+          <w:szCs w:val="24"/>
+        </w:rPr>
+        <w:t>.</w:t>
+      </w:r>
+    </w:p>
+    <w:p>
+      <w:pPr>
         <w:pStyle w:val="Heading1"/>
         <w:spacing w:before="300" w:after="150"/>
         <w:rPr>
@@ -777,6 +811,7 @@
           <w:sz w:val="24"/>
           <w:szCs w:val="24"/>
         </w:rPr>
+        <w:lastRenderedPageBreak/>
         <w:t xml:space="preserve">Primary directory: the official Cabinet Office search result currently resolves to the directory page below; the URL supplied in the original notes used </w:t>
       </w:r>
       <w:proofErr w:type="spellStart"/>
@@ -1516,16 +1551,7 @@
                 <w:sz w:val="24"/>
                 <w:szCs w:val="24"/>
               </w:rPr>
-              <w:t xml:space="preserve">Create a row-by-row register and compare each field with the ministry’s official website or verified </w:t>
-            </w:r>
-            <w:r>
-              <w:rPr>
-                <w:color w:val="000000" w:themeColor="text1"/>
-                <w:sz w:val="24"/>
-                <w:szCs w:val="24"/>
-              </w:rPr>
-              <w:lastRenderedPageBreak/>
-              <w:t>government contact source.</w:t>
+              <w:t>Create a row-by-row register and compare each field with the ministry’s official website or verified government contact source.</w:t>
             </w:r>
           </w:p>
         </w:tc>
@@ -1555,7 +1581,6 @@
                 <w:sz w:val="24"/>
                 <w:szCs w:val="24"/>
               </w:rPr>
-              <w:lastRenderedPageBreak/>
               <w:t>DIR-04</w:t>
             </w:r>
           </w:p>
@@ -1694,6 +1719,7 @@
         <w:rPr>
           <w:color w:val="000000" w:themeColor="text1"/>
         </w:rPr>
+        <w:lastRenderedPageBreak/>
         <w:t>4.2 Ministry/institution website observations supplied for review</w:t>
       </w:r>
     </w:p>
@@ -2574,7 +2600,6 @@
                 <w:sz w:val="24"/>
                 <w:szCs w:val="24"/>
               </w:rPr>
-              <w:lastRenderedPageBreak/>
               <w:t>Admin/Login Portal Exposure</w:t>
             </w:r>
           </w:p>
@@ -3066,6 +3091,7 @@
                 <w:sz w:val="24"/>
                 <w:szCs w:val="24"/>
               </w:rPr>
+              <w:lastRenderedPageBreak/>
               <w:t>PHP Version</w:t>
             </w:r>
           </w:p>
@@ -3971,7 +3997,6 @@
                 <w:sz w:val="24"/>
                 <w:szCs w:val="24"/>
               </w:rPr>
-              <w:lastRenderedPageBreak/>
               <w:t>Reachable</w:t>
             </w:r>
           </w:p>
@@ -4467,6 +4492,7 @@
                 <w:sz w:val="24"/>
                 <w:szCs w:val="24"/>
               </w:rPr>
+              <w:lastRenderedPageBreak/>
               <w:t>Domain</w:t>
             </w:r>
           </w:p>
@@ -5487,7 +5513,6 @@
                 <w:sz w:val="24"/>
                 <w:szCs w:val="24"/>
               </w:rPr>
-              <w:lastRenderedPageBreak/>
               <w:t>Current Audit Status</w:t>
             </w:r>
           </w:p>
@@ -5981,6 +6006,7 @@
                 <w:sz w:val="24"/>
                 <w:szCs w:val="24"/>
               </w:rPr>
+              <w:lastRenderedPageBreak/>
               <w:t>Admin/Login Portal Exposure</w:t>
             </w:r>
           </w:p>
@@ -6983,7 +7009,6 @@
                 <w:sz w:val="24"/>
                 <w:szCs w:val="24"/>
               </w:rPr>
-              <w:lastRenderedPageBreak/>
               <w:t>CMS / Stack</w:t>
             </w:r>
           </w:p>
@@ -7404,6 +7429,7 @@
                 <w:sz w:val="24"/>
                 <w:szCs w:val="24"/>
               </w:rPr>
+              <w:lastRenderedPageBreak/>
               <w:t>Reachable</w:t>
             </w:r>
           </w:p>
@@ -8384,7 +8410,6 @@
         <w:rPr>
           <w:color w:val="000000" w:themeColor="text1"/>
         </w:rPr>
-        <w:lastRenderedPageBreak/>
         <w:t>4.2.13 Ministry of Tourism</w:t>
       </w:r>
     </w:p>
@@ -8879,6 +8904,7 @@
                 <w:sz w:val="24"/>
                 <w:szCs w:val="24"/>
               </w:rPr>
+              <w:lastRenderedPageBreak/>
               <w:t>Risk Rating</w:t>
             </w:r>
           </w:p>
@@ -9847,7 +9873,6 @@
                 <w:sz w:val="24"/>
                 <w:szCs w:val="24"/>
               </w:rPr>
-              <w:lastRenderedPageBreak/>
               <w:t>Admin/Login Portal Exposure</w:t>
             </w:r>
           </w:p>
@@ -10332,6 +10357,7 @@
                 <w:sz w:val="24"/>
                 <w:szCs w:val="24"/>
               </w:rPr>
+              <w:lastRenderedPageBreak/>
               <w:t>CVE-2026-109618/9 Exposure</w:t>
             </w:r>
           </w:p>
@@ -11241,7 +11267,6 @@
                 <w:sz w:val="24"/>
                 <w:szCs w:val="24"/>
               </w:rPr>
-              <w:lastRenderedPageBreak/>
               <w:t>Reachable</w:t>
             </w:r>
           </w:p>
@@ -11728,6 +11753,7 @@
                 <w:sz w:val="24"/>
                 <w:szCs w:val="24"/>
               </w:rPr>
+              <w:lastRenderedPageBreak/>
               <w:t>Domain</w:t>
             </w:r>
           </w:p>
@@ -12663,17 +12689,14 @@
                 <w:szCs w:val="24"/>
               </w:rPr>
             </w:pPr>
-            <w:bookmarkStart w:id="0" w:name="_GoBack"/>
-            <w:bookmarkEnd w:id="0"/>
-            <w:r>
-              <w:rPr>
-                <w:b/>
-                <w:bCs/>
-                <w:color w:val="000000" w:themeColor="text1"/>
-                <w:sz w:val="24"/>
-                <w:szCs w:val="24"/>
-              </w:rPr>
-              <w:lastRenderedPageBreak/>
+            <w:r>
+              <w:rPr>
+                <w:b/>
+                <w:bCs/>
+                <w:color w:val="000000" w:themeColor="text1"/>
+                <w:sz w:val="24"/>
+                <w:szCs w:val="24"/>
+              </w:rPr>
               <w:t>Other Observations</w:t>
             </w:r>
           </w:p>
@@ -13156,6 +13179,7 @@
                 <w:sz w:val="24"/>
                 <w:szCs w:val="24"/>
               </w:rPr>
+              <w:lastRenderedPageBreak/>
               <w:t>CVE-2026-109618/9 Exposure</w:t>
             </w:r>
           </w:p>
@@ -14023,7 +14047,6 @@
                 <w:sz w:val="24"/>
                 <w:szCs w:val="24"/>
               </w:rPr>
-              <w:lastRenderedPageBreak/>
               <w:t>Risk Rating</w:t>
             </w:r>
           </w:p>
@@ -14561,6 +14584,7 @@
                 <w:sz w:val="24"/>
                 <w:szCs w:val="24"/>
               </w:rPr>
+              <w:lastRenderedPageBreak/>
               <w:t>Current Audit Status</w:t>
             </w:r>
           </w:p>
@@ -15466,7 +15490,6 @@
                 <w:sz w:val="24"/>
                 <w:szCs w:val="24"/>
               </w:rPr>
-              <w:lastRenderedPageBreak/>
               <w:t>Reachable</w:t>
             </w:r>
             <w:r>
@@ -16339,6 +16362,7 @@
                 <w:sz w:val="24"/>
                 <w:szCs w:val="24"/>
               </w:rPr>
+              <w:lastRenderedPageBreak/>
               <w:t>CMS / Stack</w:t>
             </w:r>
             <w:r>
@@ -18437,21 +18461,7 @@
         <w:rPr>
           <w:color w:val="000000" w:themeColor="text1"/>
         </w:rPr>
-        <w:t xml:space="preserve">4.2.29 </w:t>
-      </w:r>
-      <w:proofErr w:type="spellStart"/>
-      <w:r>
-        <w:rPr>
-          <w:color w:val="000000" w:themeColor="text1"/>
-        </w:rPr>
-        <w:t>Copperbelt</w:t>
-      </w:r>
-      <w:proofErr w:type="spellEnd"/>
-      <w:r>
-        <w:rPr>
-          <w:color w:val="000000" w:themeColor="text1"/>
-        </w:rPr>
-        <w:t xml:space="preserve"> Provincial Administration</w:t>
+        <w:t>4.2.29 Copperbelt Provincial Administration</w:t>
       </w:r>
     </w:p>
     <w:tbl>
@@ -19693,7 +19703,6 @@
                 <w:sz w:val="24"/>
                 <w:szCs w:val="24"/>
               </w:rPr>
-              <w:lastRenderedPageBreak/>
               <w:t>Admin/Login Portal Exposure</w:t>
             </w:r>
             <w:r>
@@ -20748,6 +20757,7 @@
                 <w:sz w:val="24"/>
                 <w:szCs w:val="24"/>
               </w:rPr>
+              <w:lastRenderedPageBreak/>
               <w:t>Risk Rating</w:t>
             </w:r>
             <w:r>
@@ -21979,7 +21989,6 @@
                 <w:sz w:val="24"/>
                 <w:szCs w:val="24"/>
               </w:rPr>
-              <w:lastRenderedPageBreak/>
               <w:t>CVE-2026-109618/9 Exposure</w:t>
             </w:r>
             <w:r>
@@ -23020,6 +23029,7 @@
                 <w:sz w:val="24"/>
                 <w:szCs w:val="24"/>
               </w:rPr>
+              <w:lastRenderedPageBreak/>
               <w:t>Current Audit Status</w:t>
             </w:r>
             <w:r>
@@ -24197,7 +24207,6 @@
                 <w:sz w:val="24"/>
                 <w:szCs w:val="24"/>
               </w:rPr>
-              <w:lastRenderedPageBreak/>
               <w:t>PHP Version</w:t>
             </w:r>
             <w:r>
@@ -25258,6 +25267,7 @@
                 <w:szCs w:val="24"/>
                 <w:lang w:val="en-US"/>
               </w:rPr>
+              <w:lastRenderedPageBreak/>
               <w:t>Url</w:t>
             </w:r>
             <w:proofErr w:type="spellEnd"/>
@@ -25306,6 +25316,7 @@
                 <w:sz w:val="24"/>
                 <w:szCs w:val="24"/>
               </w:rPr>
+              <w:lastRenderedPageBreak/>
               <w:t>Current Audit Status</w:t>
             </w:r>
             <w:r>
@@ -25454,7 +25465,10 @@
         <w:pStyle w:val="NormalWeb"/>
       </w:pPr>
       <w:r>
-        <w:t xml:space="preserve">A reachable login page is not a vulnerability in itself — every WordPress or similar site has one. However, an administrator login left at its default location (such as </w:t>
+        <w:t>A</w:t>
+      </w:r>
+      <w:r>
+        <w:t xml:space="preserve">n administrator login left at its default location (such as </w:t>
       </w:r>
       <w:r>
         <w:rPr>
@@ -25499,7 +25513,31 @@
       </w:r>
       <w:proofErr w:type="spellEnd"/>
       <w:r>
-        <w:t>) with no additional protections is a real exposure worth addressing. Where a login portal has no rate limiting, IP restriction, web application firewall, or multi-factor authentication, it presents an easy and predictable target for brute-force and credential-stuffing attacks. The login page being easy to find simply makes the site a more convenient target.</w:t>
+        <w:t>) with no additional protections is a real exposure worth addressing. Where a login portal has no rate limiting, IP restriction, web application firewall, or multi</w:t>
+      </w:r>
+      <w:r>
+        <w:t xml:space="preserve"> </w:t>
+      </w:r>
+      <w:r>
+        <w:t>factor authentication, it presents an easy and predictable target for brute</w:t>
+      </w:r>
+      <w:r>
+        <w:t xml:space="preserve"> </w:t>
+      </w:r>
+      <w:r>
+        <w:t>force and credential</w:t>
+      </w:r>
+      <w:r>
+        <w:t xml:space="preserve"> </w:t>
+      </w:r>
+      <w:r>
+        <w:t>stuffing attacks. The login page being easy to find simply makes the site a more convenient target</w:t>
+      </w:r>
+      <w:r>
+        <w:t xml:space="preserve"> which was found in this audit</w:t>
+      </w:r>
+      <w:r>
+        <w:t>.</w:t>
       </w:r>
     </w:p>
     <w:p>
@@ -25538,7 +25576,65 @@
           <w:sz w:val="24"/>
           <w:szCs w:val="24"/>
         </w:rPr>
-        <w:t>The PHP project’s 21 October 2026 security advisory identifies CVE-2026-109618 and CVE-2026-109619 and lists patched releases PHP 8.5.12, 8.4.27, 8.3.36, and 8.2.35. The advisory says the vulnerabilities can allow unauthenticated remote code execution in affected PHP installations. PHP 8.1 and older are no longer supported by the PHP project, although some operating-system or long-term-support vendors may backport security fixes.</w:t>
+        <w:t>The PHP project’s 21 October 2026 security advisory identifies CVE-2026-109618 and CVE-2026-109619 and lists patched releases PHP 8.5.12, 8.4.27, 8.3.36, and 8.2.35. The advisory says the vulnerabilities can allow unauthenticated remote code execution in affected PHP installations. PHP 8.1 and older are no longer supported by the PHP project, although some operating</w:t>
+      </w:r>
+      <w:r>
+        <w:rPr>
+          <w:color w:val="000000" w:themeColor="text1"/>
+          <w:sz w:val="24"/>
+          <w:szCs w:val="24"/>
+        </w:rPr>
+        <w:t xml:space="preserve"> </w:t>
+      </w:r>
+      <w:r>
+        <w:rPr>
+          <w:color w:val="000000" w:themeColor="text1"/>
+          <w:sz w:val="24"/>
+          <w:szCs w:val="24"/>
+        </w:rPr>
+        <w:t xml:space="preserve">system or </w:t>
+      </w:r>
+      <w:proofErr w:type="gramStart"/>
+      <w:r>
+        <w:rPr>
+          <w:color w:val="000000" w:themeColor="text1"/>
+          <w:sz w:val="24"/>
+          <w:szCs w:val="24"/>
+        </w:rPr>
+        <w:t>long</w:t>
+      </w:r>
+      <w:r>
+        <w:rPr>
+          <w:color w:val="000000" w:themeColor="text1"/>
+          <w:sz w:val="24"/>
+          <w:szCs w:val="24"/>
+        </w:rPr>
+        <w:t xml:space="preserve"> </w:t>
+      </w:r>
+      <w:r>
+        <w:rPr>
+          <w:color w:val="000000" w:themeColor="text1"/>
+          <w:sz w:val="24"/>
+          <w:szCs w:val="24"/>
+        </w:rPr>
+        <w:t>term</w:t>
+      </w:r>
+      <w:proofErr w:type="gramEnd"/>
+      <w:r>
+        <w:rPr>
+          <w:color w:val="000000" w:themeColor="text1"/>
+          <w:sz w:val="24"/>
+          <w:szCs w:val="24"/>
+        </w:rPr>
+        <w:t xml:space="preserve"> </w:t>
+      </w:r>
+      <w:r>
+        <w:rPr>
+          <w:color w:val="000000" w:themeColor="text1"/>
+          <w:sz w:val="24"/>
+          <w:szCs w:val="24"/>
+        </w:rPr>
+        <w:t>support vendors may backport security fixes.</w:t>
       </w:r>
     </w:p>
     <w:p>
@@ -25556,7 +25652,7 @@
           <w:sz w:val="24"/>
           <w:szCs w:val="24"/>
         </w:rPr>
-        <w:t xml:space="preserve">Relevance to this audit: this is a reason for system owners to inventory PHP versions and patch status. It is not evidence that any particular ministry site is vulnerable. A public website’s use of WordPress, Joomla, Drupal, or PHP cannot reliably establish the installed PHP version or whether </w:t>
+        <w:t>Relevance to this audit: this is a reason for system</w:t>
       </w:r>
       <w:r>
         <w:rPr>
@@ -25564,8 +25660,23 @@
           <w:sz w:val="24"/>
           <w:szCs w:val="24"/>
         </w:rPr>
-        <w:lastRenderedPageBreak/>
-        <w:t>vendor backports have been applied. The authorized hosting/system administrator should confirm versions and patch status from the server inventory.</w:t>
+        <w:t>s</w:t>
+      </w:r>
+      <w:r>
+        <w:rPr>
+          <w:color w:val="000000" w:themeColor="text1"/>
+          <w:sz w:val="24"/>
+          <w:szCs w:val="24"/>
+        </w:rPr>
+        <w:t xml:space="preserve"> to inventory PHP versions and patch status</w:t>
+      </w:r>
+      <w:r>
+        <w:rPr>
+          <w:color w:val="000000" w:themeColor="text1"/>
+          <w:sz w:val="24"/>
+          <w:szCs w:val="24"/>
+        </w:rPr>
+        <w:t>.</w:t>
       </w:r>
     </w:p>
     <w:p>
@@ -25602,774 +25713,6 @@
           <w:szCs w:val="28"/>
         </w:rPr>
         <w:lastRenderedPageBreak/>
-        <w:t>5. Preliminary Risk Treatment</w:t>
-      </w:r>
-    </w:p>
-    <w:tbl>
-      <w:tblPr>
-        <w:tblW w:w="9350" w:type="dxa"/>
-        <w:tblBorders>
-          <w:top w:val="single" w:sz="4" w:space="0" w:color="auto"/>
-          <w:left w:val="single" w:sz="4" w:space="0" w:color="auto"/>
-          <w:bottom w:val="single" w:sz="4" w:space="0" w:color="auto"/>
-          <w:right w:val="single" w:sz="4" w:space="0" w:color="auto"/>
-          <w:insideH w:val="single" w:sz="4" w:space="0" w:color="auto"/>
-          <w:insideV w:val="single" w:sz="4" w:space="0" w:color="auto"/>
-        </w:tblBorders>
-        <w:tblCellMar>
-          <w:left w:w="10" w:type="dxa"/>
-          <w:right w:w="10" w:type="dxa"/>
-        </w:tblCellMar>
-        <w:tblLook w:val="0000" w:firstRow="0" w:lastRow="0" w:firstColumn="0" w:lastColumn="0" w:noHBand="0" w:noVBand="0"/>
-      </w:tblPr>
-      <w:tblGrid>
-        <w:gridCol w:w="2300"/>
-        <w:gridCol w:w="1500"/>
-        <w:gridCol w:w="2800"/>
-        <w:gridCol w:w="2750"/>
-      </w:tblGrid>
-      <w:tr>
-        <w:trPr>
-          <w:tblHeader/>
-        </w:trPr>
-        <w:tc>
-          <w:tcPr>
-            <w:tcW w:w="2300" w:type="dxa"/>
-            <w:shd w:val="clear" w:color="auto" w:fill="D9D9D9"/>
-            <w:tcMar>
-              <w:top w:w="80" w:type="dxa"/>
-              <w:left w:w="100" w:type="dxa"/>
-              <w:bottom w:w="80" w:type="dxa"/>
-              <w:right w:w="100" w:type="dxa"/>
-            </w:tcMar>
-          </w:tcPr>
-          <w:p>
-            <w:pPr>
-              <w:rPr>
-                <w:color w:val="000000" w:themeColor="text1"/>
-                <w:sz w:val="24"/>
-                <w:szCs w:val="24"/>
-              </w:rPr>
-            </w:pPr>
-            <w:r>
-              <w:rPr>
-                <w:b/>
-                <w:bCs/>
-                <w:color w:val="000000" w:themeColor="text1"/>
-                <w:sz w:val="24"/>
-                <w:szCs w:val="24"/>
-              </w:rPr>
-              <w:t>Item</w:t>
-            </w:r>
-          </w:p>
-        </w:tc>
-        <w:tc>
-          <w:tcPr>
-            <w:tcW w:w="1500" w:type="dxa"/>
-            <w:shd w:val="clear" w:color="auto" w:fill="D9D9D9"/>
-            <w:tcMar>
-              <w:top w:w="80" w:type="dxa"/>
-              <w:left w:w="100" w:type="dxa"/>
-              <w:bottom w:w="80" w:type="dxa"/>
-              <w:right w:w="100" w:type="dxa"/>
-            </w:tcMar>
-          </w:tcPr>
-          <w:p>
-            <w:pPr>
-              <w:rPr>
-                <w:color w:val="000000" w:themeColor="text1"/>
-                <w:sz w:val="24"/>
-                <w:szCs w:val="24"/>
-              </w:rPr>
-            </w:pPr>
-            <w:r>
-              <w:rPr>
-                <w:b/>
-                <w:bCs/>
-                <w:color w:val="000000" w:themeColor="text1"/>
-                <w:sz w:val="24"/>
-                <w:szCs w:val="24"/>
-              </w:rPr>
-              <w:t>Provisional priority</w:t>
-            </w:r>
-          </w:p>
-        </w:tc>
-        <w:tc>
-          <w:tcPr>
-            <w:tcW w:w="2800" w:type="dxa"/>
-            <w:shd w:val="clear" w:color="auto" w:fill="D9D9D9"/>
-            <w:tcMar>
-              <w:top w:w="80" w:type="dxa"/>
-              <w:left w:w="100" w:type="dxa"/>
-              <w:bottom w:w="80" w:type="dxa"/>
-              <w:right w:w="100" w:type="dxa"/>
-            </w:tcMar>
-          </w:tcPr>
-          <w:p>
-            <w:pPr>
-              <w:rPr>
-                <w:color w:val="000000" w:themeColor="text1"/>
-                <w:sz w:val="24"/>
-                <w:szCs w:val="24"/>
-              </w:rPr>
-            </w:pPr>
-            <w:r>
-              <w:rPr>
-                <w:b/>
-                <w:bCs/>
-                <w:color w:val="000000" w:themeColor="text1"/>
-                <w:sz w:val="24"/>
-                <w:szCs w:val="24"/>
-              </w:rPr>
-              <w:t>Basis</w:t>
-            </w:r>
-          </w:p>
-        </w:tc>
-        <w:tc>
-          <w:tcPr>
-            <w:tcW w:w="2750" w:type="dxa"/>
-            <w:shd w:val="clear" w:color="auto" w:fill="D9D9D9"/>
-            <w:tcMar>
-              <w:top w:w="80" w:type="dxa"/>
-              <w:left w:w="100" w:type="dxa"/>
-              <w:bottom w:w="80" w:type="dxa"/>
-              <w:right w:w="100" w:type="dxa"/>
-            </w:tcMar>
-          </w:tcPr>
-          <w:p>
-            <w:pPr>
-              <w:rPr>
-                <w:color w:val="000000" w:themeColor="text1"/>
-                <w:sz w:val="24"/>
-                <w:szCs w:val="24"/>
-              </w:rPr>
-            </w:pPr>
-            <w:r>
-              <w:rPr>
-                <w:b/>
-                <w:bCs/>
-                <w:color w:val="000000" w:themeColor="text1"/>
-                <w:sz w:val="24"/>
-                <w:szCs w:val="24"/>
-              </w:rPr>
-              <w:t>Next step</w:t>
-            </w:r>
-          </w:p>
-        </w:tc>
-      </w:tr>
-      <w:tr>
-        <w:tc>
-          <w:tcPr>
-            <w:tcW w:w="2300" w:type="dxa"/>
-            <w:tcMar>
-              <w:top w:w="80" w:type="dxa"/>
-              <w:left w:w="100" w:type="dxa"/>
-              <w:bottom w:w="80" w:type="dxa"/>
-              <w:right w:w="100" w:type="dxa"/>
-            </w:tcMar>
-          </w:tcPr>
-          <w:p>
-            <w:pPr>
-              <w:rPr>
-                <w:color w:val="000000" w:themeColor="text1"/>
-                <w:sz w:val="24"/>
-                <w:szCs w:val="24"/>
-              </w:rPr>
-            </w:pPr>
-            <w:r>
-              <w:rPr>
-                <w:color w:val="000000" w:themeColor="text1"/>
-                <w:sz w:val="24"/>
-                <w:szCs w:val="24"/>
-              </w:rPr>
-              <w:t>DIR-01 spelling issue</w:t>
-            </w:r>
-          </w:p>
-        </w:tc>
-        <w:tc>
-          <w:tcPr>
-            <w:tcW w:w="1500" w:type="dxa"/>
-            <w:tcMar>
-              <w:top w:w="80" w:type="dxa"/>
-              <w:left w:w="100" w:type="dxa"/>
-              <w:bottom w:w="80" w:type="dxa"/>
-              <w:right w:w="100" w:type="dxa"/>
-            </w:tcMar>
-          </w:tcPr>
-          <w:p>
-            <w:pPr>
-              <w:rPr>
-                <w:color w:val="000000" w:themeColor="text1"/>
-                <w:sz w:val="24"/>
-                <w:szCs w:val="24"/>
-              </w:rPr>
-            </w:pPr>
-            <w:r>
-              <w:rPr>
-                <w:color w:val="000000" w:themeColor="text1"/>
-                <w:sz w:val="24"/>
-                <w:szCs w:val="24"/>
-              </w:rPr>
-              <w:t>Low</w:t>
-            </w:r>
-          </w:p>
-        </w:tc>
-        <w:tc>
-          <w:tcPr>
-            <w:tcW w:w="2800" w:type="dxa"/>
-            <w:tcMar>
-              <w:top w:w="80" w:type="dxa"/>
-              <w:left w:w="100" w:type="dxa"/>
-              <w:bottom w:w="80" w:type="dxa"/>
-              <w:right w:w="100" w:type="dxa"/>
-            </w:tcMar>
-          </w:tcPr>
-          <w:p>
-            <w:pPr>
-              <w:rPr>
-                <w:color w:val="000000" w:themeColor="text1"/>
-                <w:sz w:val="24"/>
-                <w:szCs w:val="24"/>
-              </w:rPr>
-            </w:pPr>
-            <w:r>
-              <w:rPr>
-                <w:color w:val="000000" w:themeColor="text1"/>
-                <w:sz w:val="24"/>
-                <w:szCs w:val="24"/>
-              </w:rPr>
-              <w:t>Visible content-quality issue; no direct security impact established.</w:t>
-            </w:r>
-          </w:p>
-        </w:tc>
-        <w:tc>
-          <w:tcPr>
-            <w:tcW w:w="2750" w:type="dxa"/>
-            <w:tcMar>
-              <w:top w:w="80" w:type="dxa"/>
-              <w:left w:w="100" w:type="dxa"/>
-              <w:bottom w:w="80" w:type="dxa"/>
-              <w:right w:w="100" w:type="dxa"/>
-            </w:tcMar>
-          </w:tcPr>
-          <w:p>
-            <w:pPr>
-              <w:rPr>
-                <w:color w:val="000000" w:themeColor="text1"/>
-                <w:sz w:val="24"/>
-                <w:szCs w:val="24"/>
-              </w:rPr>
-            </w:pPr>
-            <w:r>
-              <w:rPr>
-                <w:color w:val="000000" w:themeColor="text1"/>
-                <w:sz w:val="24"/>
-                <w:szCs w:val="24"/>
-              </w:rPr>
-              <w:t>Correct after confirmation.</w:t>
-            </w:r>
-          </w:p>
-        </w:tc>
-      </w:tr>
-      <w:tr>
-        <w:tc>
-          <w:tcPr>
-            <w:tcW w:w="2300" w:type="dxa"/>
-            <w:tcMar>
-              <w:top w:w="80" w:type="dxa"/>
-              <w:left w:w="100" w:type="dxa"/>
-              <w:bottom w:w="80" w:type="dxa"/>
-              <w:right w:w="100" w:type="dxa"/>
-            </w:tcMar>
-          </w:tcPr>
-          <w:p>
-            <w:pPr>
-              <w:rPr>
-                <w:color w:val="000000" w:themeColor="text1"/>
-                <w:sz w:val="24"/>
-                <w:szCs w:val="24"/>
-              </w:rPr>
-            </w:pPr>
-            <w:r>
-              <w:rPr>
-                <w:color w:val="000000" w:themeColor="text1"/>
-                <w:sz w:val="24"/>
-                <w:szCs w:val="24"/>
-              </w:rPr>
-              <w:t>DIR-02 ministry naming</w:t>
-            </w:r>
-          </w:p>
-        </w:tc>
-        <w:tc>
-          <w:tcPr>
-            <w:tcW w:w="1500" w:type="dxa"/>
-            <w:tcMar>
-              <w:top w:w="80" w:type="dxa"/>
-              <w:left w:w="100" w:type="dxa"/>
-              <w:bottom w:w="80" w:type="dxa"/>
-              <w:right w:w="100" w:type="dxa"/>
-            </w:tcMar>
-          </w:tcPr>
-          <w:p>
-            <w:pPr>
-              <w:rPr>
-                <w:color w:val="000000" w:themeColor="text1"/>
-                <w:sz w:val="24"/>
-                <w:szCs w:val="24"/>
-              </w:rPr>
-            </w:pPr>
-            <w:r>
-              <w:rPr>
-                <w:color w:val="000000" w:themeColor="text1"/>
-                <w:sz w:val="24"/>
-                <w:szCs w:val="24"/>
-              </w:rPr>
-              <w:t>Low</w:t>
-            </w:r>
-          </w:p>
-        </w:tc>
-        <w:tc>
-          <w:tcPr>
-            <w:tcW w:w="2800" w:type="dxa"/>
-            <w:tcMar>
-              <w:top w:w="80" w:type="dxa"/>
-              <w:left w:w="100" w:type="dxa"/>
-              <w:bottom w:w="80" w:type="dxa"/>
-              <w:right w:w="100" w:type="dxa"/>
-            </w:tcMar>
-          </w:tcPr>
-          <w:p>
-            <w:pPr>
-              <w:rPr>
-                <w:color w:val="000000" w:themeColor="text1"/>
-                <w:sz w:val="24"/>
-                <w:szCs w:val="24"/>
-              </w:rPr>
-            </w:pPr>
-            <w:r>
-              <w:rPr>
-                <w:color w:val="000000" w:themeColor="text1"/>
-                <w:sz w:val="24"/>
-                <w:szCs w:val="24"/>
-              </w:rPr>
-              <w:t>Possible naming inconsistency.</w:t>
-            </w:r>
-          </w:p>
-        </w:tc>
-        <w:tc>
-          <w:tcPr>
-            <w:tcW w:w="2750" w:type="dxa"/>
-            <w:tcMar>
-              <w:top w:w="80" w:type="dxa"/>
-              <w:left w:w="100" w:type="dxa"/>
-              <w:bottom w:w="80" w:type="dxa"/>
-              <w:right w:w="100" w:type="dxa"/>
-            </w:tcMar>
-          </w:tcPr>
-          <w:p>
-            <w:pPr>
-              <w:rPr>
-                <w:color w:val="000000" w:themeColor="text1"/>
-                <w:sz w:val="24"/>
-                <w:szCs w:val="24"/>
-              </w:rPr>
-            </w:pPr>
-            <w:r>
-              <w:rPr>
-                <w:color w:val="000000" w:themeColor="text1"/>
-                <w:sz w:val="24"/>
-                <w:szCs w:val="24"/>
-              </w:rPr>
-              <w:t>Confirm official name.</w:t>
-            </w:r>
-          </w:p>
-        </w:tc>
-      </w:tr>
-      <w:tr>
-        <w:tc>
-          <w:tcPr>
-            <w:tcW w:w="2300" w:type="dxa"/>
-            <w:tcMar>
-              <w:top w:w="80" w:type="dxa"/>
-              <w:left w:w="100" w:type="dxa"/>
-              <w:bottom w:w="80" w:type="dxa"/>
-              <w:right w:w="100" w:type="dxa"/>
-            </w:tcMar>
-          </w:tcPr>
-          <w:p>
-            <w:pPr>
-              <w:rPr>
-                <w:color w:val="000000" w:themeColor="text1"/>
-                <w:sz w:val="24"/>
-                <w:szCs w:val="24"/>
-              </w:rPr>
-            </w:pPr>
-            <w:r>
-              <w:rPr>
-                <w:color w:val="000000" w:themeColor="text1"/>
-                <w:sz w:val="24"/>
-                <w:szCs w:val="24"/>
-              </w:rPr>
-              <w:t>Missing or stale contact/link data</w:t>
-            </w:r>
-          </w:p>
-        </w:tc>
-        <w:tc>
-          <w:tcPr>
-            <w:tcW w:w="1500" w:type="dxa"/>
-            <w:tcMar>
-              <w:top w:w="80" w:type="dxa"/>
-              <w:left w:w="100" w:type="dxa"/>
-              <w:bottom w:w="80" w:type="dxa"/>
-              <w:right w:w="100" w:type="dxa"/>
-            </w:tcMar>
-          </w:tcPr>
-          <w:p>
-            <w:pPr>
-              <w:rPr>
-                <w:color w:val="000000" w:themeColor="text1"/>
-                <w:sz w:val="24"/>
-                <w:szCs w:val="24"/>
-              </w:rPr>
-            </w:pPr>
-            <w:r>
-              <w:rPr>
-                <w:color w:val="000000" w:themeColor="text1"/>
-                <w:sz w:val="24"/>
-                <w:szCs w:val="24"/>
-              </w:rPr>
-              <w:t>Low</w:t>
-            </w:r>
-          </w:p>
-        </w:tc>
-        <w:tc>
-          <w:tcPr>
-            <w:tcW w:w="2800" w:type="dxa"/>
-            <w:tcMar>
-              <w:top w:w="80" w:type="dxa"/>
-              <w:left w:w="100" w:type="dxa"/>
-              <w:bottom w:w="80" w:type="dxa"/>
-              <w:right w:w="100" w:type="dxa"/>
-            </w:tcMar>
-          </w:tcPr>
-          <w:p>
-            <w:pPr>
-              <w:rPr>
-                <w:color w:val="000000" w:themeColor="text1"/>
-                <w:sz w:val="24"/>
-                <w:szCs w:val="24"/>
-              </w:rPr>
-            </w:pPr>
-            <w:r>
-              <w:rPr>
-                <w:color w:val="000000" w:themeColor="text1"/>
-                <w:sz w:val="24"/>
-                <w:szCs w:val="24"/>
-              </w:rPr>
-              <w:t>Impact depends on actual entries and broken links.</w:t>
-            </w:r>
-          </w:p>
-        </w:tc>
-        <w:tc>
-          <w:tcPr>
-            <w:tcW w:w="2750" w:type="dxa"/>
-            <w:tcMar>
-              <w:top w:w="80" w:type="dxa"/>
-              <w:left w:w="100" w:type="dxa"/>
-              <w:bottom w:w="80" w:type="dxa"/>
-              <w:right w:w="100" w:type="dxa"/>
-            </w:tcMar>
-          </w:tcPr>
-          <w:p>
-            <w:pPr>
-              <w:rPr>
-                <w:color w:val="000000" w:themeColor="text1"/>
-                <w:sz w:val="24"/>
-                <w:szCs w:val="24"/>
-              </w:rPr>
-            </w:pPr>
-            <w:r>
-              <w:rPr>
-                <w:color w:val="000000" w:themeColor="text1"/>
-                <w:sz w:val="24"/>
-                <w:szCs w:val="24"/>
-              </w:rPr>
-              <w:t>Complete register and retain evidence.</w:t>
-            </w:r>
-          </w:p>
-        </w:tc>
-      </w:tr>
-      <w:tr>
-        <w:tc>
-          <w:tcPr>
-            <w:tcW w:w="2300" w:type="dxa"/>
-            <w:tcMar>
-              <w:top w:w="80" w:type="dxa"/>
-              <w:left w:w="100" w:type="dxa"/>
-              <w:bottom w:w="80" w:type="dxa"/>
-              <w:right w:w="100" w:type="dxa"/>
-            </w:tcMar>
-          </w:tcPr>
-          <w:p>
-            <w:pPr>
-              <w:rPr>
-                <w:color w:val="000000" w:themeColor="text1"/>
-                <w:sz w:val="24"/>
-                <w:szCs w:val="24"/>
-              </w:rPr>
-            </w:pPr>
-            <w:r>
-              <w:rPr>
-                <w:color w:val="000000" w:themeColor="text1"/>
-                <w:sz w:val="24"/>
-                <w:szCs w:val="24"/>
-              </w:rPr>
-              <w:t>Public login page</w:t>
-            </w:r>
-          </w:p>
-        </w:tc>
-        <w:tc>
-          <w:tcPr>
-            <w:tcW w:w="1500" w:type="dxa"/>
-            <w:tcMar>
-              <w:top w:w="80" w:type="dxa"/>
-              <w:left w:w="100" w:type="dxa"/>
-              <w:bottom w:w="80" w:type="dxa"/>
-              <w:right w:w="100" w:type="dxa"/>
-            </w:tcMar>
-          </w:tcPr>
-          <w:p>
-            <w:pPr>
-              <w:rPr>
-                <w:color w:val="000000" w:themeColor="text1"/>
-                <w:sz w:val="24"/>
-                <w:szCs w:val="24"/>
-              </w:rPr>
-            </w:pPr>
-            <w:r>
-              <w:rPr>
-                <w:color w:val="000000" w:themeColor="text1"/>
-                <w:sz w:val="24"/>
-                <w:szCs w:val="24"/>
-              </w:rPr>
-              <w:t>Not rated without a demonstrated weakness</w:t>
-            </w:r>
-          </w:p>
-        </w:tc>
-        <w:tc>
-          <w:tcPr>
-            <w:tcW w:w="2800" w:type="dxa"/>
-            <w:tcMar>
-              <w:top w:w="80" w:type="dxa"/>
-              <w:left w:w="100" w:type="dxa"/>
-              <w:bottom w:w="80" w:type="dxa"/>
-              <w:right w:w="100" w:type="dxa"/>
-            </w:tcMar>
-          </w:tcPr>
-          <w:p>
-            <w:pPr>
-              <w:rPr>
-                <w:color w:val="000000" w:themeColor="text1"/>
-                <w:sz w:val="24"/>
-                <w:szCs w:val="24"/>
-              </w:rPr>
-            </w:pPr>
-            <w:r>
-              <w:rPr>
-                <w:color w:val="000000" w:themeColor="text1"/>
-                <w:sz w:val="24"/>
-                <w:szCs w:val="24"/>
-              </w:rPr>
-              <w:t>Public reachability alone is not a vulnerability.</w:t>
-            </w:r>
-          </w:p>
-        </w:tc>
-        <w:tc>
-          <w:tcPr>
-            <w:tcW w:w="2750" w:type="dxa"/>
-            <w:tcMar>
-              <w:top w:w="80" w:type="dxa"/>
-              <w:left w:w="100" w:type="dxa"/>
-              <w:bottom w:w="80" w:type="dxa"/>
-              <w:right w:w="100" w:type="dxa"/>
-            </w:tcMar>
-          </w:tcPr>
-          <w:p>
-            <w:pPr>
-              <w:rPr>
-                <w:color w:val="000000" w:themeColor="text1"/>
-                <w:sz w:val="24"/>
-                <w:szCs w:val="24"/>
-              </w:rPr>
-            </w:pPr>
-            <w:r>
-              <w:rPr>
-                <w:color w:val="000000" w:themeColor="text1"/>
-                <w:sz w:val="24"/>
-                <w:szCs w:val="24"/>
-              </w:rPr>
-              <w:t>Review authentication protections only under written authorization.</w:t>
-            </w:r>
-          </w:p>
-        </w:tc>
-      </w:tr>
-      <w:tr>
-        <w:tc>
-          <w:tcPr>
-            <w:tcW w:w="2300" w:type="dxa"/>
-            <w:tcMar>
-              <w:top w:w="80" w:type="dxa"/>
-              <w:left w:w="100" w:type="dxa"/>
-              <w:bottom w:w="80" w:type="dxa"/>
-              <w:right w:w="100" w:type="dxa"/>
-            </w:tcMar>
-          </w:tcPr>
-          <w:p>
-            <w:pPr>
-              <w:rPr>
-                <w:color w:val="000000" w:themeColor="text1"/>
-                <w:sz w:val="24"/>
-                <w:szCs w:val="24"/>
-              </w:rPr>
-            </w:pPr>
-            <w:r>
-              <w:rPr>
-                <w:color w:val="000000" w:themeColor="text1"/>
-                <w:sz w:val="24"/>
-                <w:szCs w:val="24"/>
-              </w:rPr>
-              <w:t>Reported directory/server exposure on mim.gov.zm</w:t>
-            </w:r>
-          </w:p>
-        </w:tc>
-        <w:tc>
-          <w:tcPr>
-            <w:tcW w:w="1500" w:type="dxa"/>
-            <w:tcMar>
-              <w:top w:w="80" w:type="dxa"/>
-              <w:left w:w="100" w:type="dxa"/>
-              <w:bottom w:w="80" w:type="dxa"/>
-              <w:right w:w="100" w:type="dxa"/>
-            </w:tcMar>
-          </w:tcPr>
-          <w:p>
-            <w:pPr>
-              <w:rPr>
-                <w:color w:val="000000" w:themeColor="text1"/>
-                <w:sz w:val="24"/>
-                <w:szCs w:val="24"/>
-              </w:rPr>
-            </w:pPr>
-            <w:r>
-              <w:rPr>
-                <w:color w:val="000000" w:themeColor="text1"/>
-                <w:sz w:val="24"/>
-                <w:szCs w:val="24"/>
-              </w:rPr>
-              <w:t>High impact</w:t>
-            </w:r>
-          </w:p>
-        </w:tc>
-        <w:tc>
-          <w:tcPr>
-            <w:tcW w:w="2800" w:type="dxa"/>
-            <w:tcMar>
-              <w:top w:w="80" w:type="dxa"/>
-              <w:left w:w="100" w:type="dxa"/>
-              <w:bottom w:w="80" w:type="dxa"/>
-              <w:right w:w="100" w:type="dxa"/>
-            </w:tcMar>
-          </w:tcPr>
-          <w:p>
-            <w:pPr>
-              <w:rPr>
-                <w:color w:val="000000" w:themeColor="text1"/>
-                <w:sz w:val="24"/>
-                <w:szCs w:val="24"/>
-              </w:rPr>
-            </w:pPr>
-            <w:r>
-              <w:rPr>
-                <w:color w:val="000000" w:themeColor="text1"/>
-                <w:sz w:val="24"/>
-                <w:szCs w:val="24"/>
-              </w:rPr>
-              <w:t>U</w:t>
-            </w:r>
-            <w:r>
-              <w:rPr>
-                <w:color w:val="000000" w:themeColor="text1"/>
-                <w:sz w:val="24"/>
-                <w:szCs w:val="24"/>
-              </w:rPr>
-              <w:t xml:space="preserve">nintended file/server information </w:t>
-            </w:r>
-            <w:r>
-              <w:rPr>
-                <w:color w:val="000000" w:themeColor="text1"/>
-                <w:sz w:val="24"/>
-                <w:szCs w:val="24"/>
-              </w:rPr>
-              <w:t>exposure.</w:t>
-            </w:r>
-          </w:p>
-        </w:tc>
-        <w:tc>
-          <w:tcPr>
-            <w:tcW w:w="2750" w:type="dxa"/>
-            <w:tcMar>
-              <w:top w:w="80" w:type="dxa"/>
-              <w:left w:w="100" w:type="dxa"/>
-              <w:bottom w:w="80" w:type="dxa"/>
-              <w:right w:w="100" w:type="dxa"/>
-            </w:tcMar>
-          </w:tcPr>
-          <w:p>
-            <w:pPr>
-              <w:rPr>
-                <w:color w:val="000000" w:themeColor="text1"/>
-                <w:sz w:val="24"/>
-                <w:szCs w:val="24"/>
-              </w:rPr>
-            </w:pPr>
-            <w:r>
-              <w:rPr>
-                <w:color w:val="000000" w:themeColor="text1"/>
-                <w:sz w:val="24"/>
-                <w:szCs w:val="24"/>
-              </w:rPr>
-              <w:t>Notify supervisor and authorized site administrator; capture only minimal public evidence; ask the owner to verify server configuration and logs.</w:t>
-            </w:r>
-          </w:p>
-        </w:tc>
-      </w:tr>
-    </w:tbl>
-    <w:p>
-      <w:pPr>
-        <w:spacing w:after="200"/>
-        <w:rPr>
-          <w:color w:val="000000" w:themeColor="text1"/>
-        </w:rPr>
-      </w:pPr>
-    </w:p>
-    <w:p>
-      <w:pPr>
-        <w:pStyle w:val="Heading1"/>
-        <w:spacing w:before="300" w:after="150"/>
-        <w:rPr>
-          <w:b/>
-          <w:color w:val="000000" w:themeColor="text1"/>
-          <w:sz w:val="28"/>
-          <w:szCs w:val="28"/>
-        </w:rPr>
-      </w:pPr>
-      <w:r>
-        <w:rPr>
-          <w:b/>
-          <w:color w:val="000000" w:themeColor="text1"/>
-          <w:sz w:val="28"/>
-          <w:szCs w:val="28"/>
-        </w:rPr>
         <w:t>6</w:t>
       </w:r>
       <w:r>
@@ -26384,20 +25727,170 @@
     </w:p>
     <w:p>
       <w:pPr>
-        <w:spacing w:after="120"/>
         <w:rPr>
-          <w:color w:val="000000" w:themeColor="text1"/>
           <w:sz w:val="24"/>
           <w:szCs w:val="24"/>
         </w:rPr>
       </w:pPr>
       <w:r>
         <w:rPr>
-          <w:color w:val="000000" w:themeColor="text1"/>
           <w:sz w:val="24"/>
           <w:szCs w:val="24"/>
         </w:rPr>
-        <w:t>The strongest confirmed issue currently visible in the Cabinet Office directory text is a spelling inconsistency in the Ministry of Information and Media entry; the ministry-name wording for Youth, Sports and Arts also requires confirmation. Other directory checks remain to be completed systematically. The supplied technical notes raise issues worth investigating, particularly the reported unexpected content on mim.gov.zm and the need to verify PHP patch status, but the current evidence does not justify declaring all ministry websites high risk or labelling a specific ministry site critically vulnerable.</w:t>
+        <w:t>The preliminary security audit identified several concerns affecting the accuracy, accessibility, reliability, and potential security of the reviewed Zambian Government websites. These include spelling errors and inconsistencies on the Cabinet Office page, inaccessible websites, SSL/TLS certificate issues, publicly accessible administrative login pages, reported outdated software versions, and possible exposure of server directories or files on the Ministry of Information and Media website.</w:t>
+      </w:r>
+    </w:p>
+    <w:p>
+      <w:pPr>
+        <w:rPr>
+          <w:sz w:val="24"/>
+          <w:szCs w:val="24"/>
+        </w:rPr>
+      </w:pPr>
+      <w:r>
+        <w:rPr>
+          <w:sz w:val="24"/>
+          <w:szCs w:val="24"/>
+        </w:rPr>
+        <w:t>The findings recorded in the report indicate potential weaknesses in website configuration and security. However, while some issues were directly observed, others remain unverified. In particular, the reported outdated PHP versions and possible exposure to CVE-2026-109618 and CVE-2026-109619 have not been confirmed through server</w:t>
+      </w:r>
+      <w:r>
+        <w:rPr>
+          <w:sz w:val="24"/>
+          <w:szCs w:val="24"/>
+        </w:rPr>
+        <w:t xml:space="preserve"> </w:t>
+      </w:r>
+      <w:r>
+        <w:rPr>
+          <w:sz w:val="24"/>
+          <w:szCs w:val="24"/>
+        </w:rPr>
+        <w:t>level verification</w:t>
+      </w:r>
+      <w:r>
+        <w:rPr>
+          <w:sz w:val="24"/>
+          <w:szCs w:val="24"/>
+        </w:rPr>
+        <w:t xml:space="preserve"> and </w:t>
+      </w:r>
+      <w:proofErr w:type="gramStart"/>
+      <w:r>
+        <w:rPr>
+          <w:sz w:val="24"/>
+          <w:szCs w:val="24"/>
+        </w:rPr>
+        <w:t>actually confirming</w:t>
+      </w:r>
+      <w:proofErr w:type="gramEnd"/>
+      <w:r>
+        <w:rPr>
+          <w:sz w:val="24"/>
+          <w:szCs w:val="24"/>
+        </w:rPr>
+        <w:t xml:space="preserve"> </w:t>
+      </w:r>
+      <w:r>
+        <w:rPr>
+          <w:sz w:val="24"/>
+          <w:szCs w:val="24"/>
+        </w:rPr>
+        <w:t xml:space="preserve">the version of </w:t>
+      </w:r>
+      <w:proofErr w:type="spellStart"/>
+      <w:r>
+        <w:rPr>
+          <w:sz w:val="24"/>
+          <w:szCs w:val="24"/>
+        </w:rPr>
+        <w:t>php</w:t>
+      </w:r>
+      <w:proofErr w:type="spellEnd"/>
+      <w:r>
+        <w:rPr>
+          <w:sz w:val="24"/>
+          <w:szCs w:val="24"/>
+        </w:rPr>
+        <w:t xml:space="preserve"> been used</w:t>
+      </w:r>
+      <w:r>
+        <w:rPr>
+          <w:sz w:val="24"/>
+          <w:szCs w:val="24"/>
+        </w:rPr>
+        <w:t xml:space="preserve">. </w:t>
+      </w:r>
+    </w:p>
+    <w:p>
+      <w:pPr>
+        <w:rPr>
+          <w:sz w:val="32"/>
+          <w:szCs w:val="32"/>
+        </w:rPr>
+      </w:pPr>
+      <w:r>
+        <w:rPr>
+          <w:sz w:val="24"/>
+          <w:szCs w:val="24"/>
+        </w:rPr>
+        <w:t>In terms of risk prioritisation, the reported exposure of server directories or files represents a potentially significant concern, followed by confirmed software vulnerabilities and weaknesses in administrative access controls. Website availability, certificate issues, and page</w:t>
+      </w:r>
+      <w:r>
+        <w:rPr>
+          <w:sz w:val="24"/>
+          <w:szCs w:val="24"/>
+        </w:rPr>
+        <w:t xml:space="preserve"> </w:t>
+      </w:r>
+      <w:r>
+        <w:rPr>
+          <w:sz w:val="24"/>
+          <w:szCs w:val="24"/>
+        </w:rPr>
+        <w:t xml:space="preserve">content inconsistencies also affect the reliability and professionalism of </w:t>
+      </w:r>
+      <w:r>
+        <w:rPr>
+          <w:sz w:val="24"/>
+          <w:szCs w:val="24"/>
+        </w:rPr>
+        <w:t xml:space="preserve">the </w:t>
+      </w:r>
+      <w:r>
+        <w:rPr>
+          <w:sz w:val="24"/>
+          <w:szCs w:val="24"/>
+        </w:rPr>
+        <w:t>government websites</w:t>
+      </w:r>
+      <w:r>
+        <w:rPr>
+          <w:sz w:val="24"/>
+          <w:szCs w:val="24"/>
+        </w:rPr>
+        <w:t xml:space="preserve"> which have been audited</w:t>
+      </w:r>
+      <w:r>
+        <w:rPr>
+          <w:sz w:val="24"/>
+          <w:szCs w:val="24"/>
+        </w:rPr>
+        <w:t>. Overall, the audit provides an initial picture of the issues identified and reported, while distinguishing observed problems from security vulnerabilities</w:t>
+      </w:r>
+      <w:r>
+        <w:rPr>
+          <w:sz w:val="24"/>
+          <w:szCs w:val="24"/>
+        </w:rPr>
+        <w:t xml:space="preserve"> confirmed and others needing </w:t>
+      </w:r>
+      <w:r>
+        <w:rPr>
+          <w:sz w:val="24"/>
+          <w:szCs w:val="24"/>
+        </w:rPr>
+        <w:t>confirmation.</w:t>
       </w:r>
     </w:p>
     <w:p>
@@ -26441,7 +25934,21 @@
         <w:rPr>
           <w:color w:val="000000" w:themeColor="text1"/>
         </w:rPr>
-        <w:t>Cabinet Office Zambia — Ministries and Provincial Administrations:</w:t>
+        <w:t xml:space="preserve">Cabinet Office </w:t>
+      </w:r>
+      <w:proofErr w:type="gramStart"/>
+      <w:r>
+        <w:rPr>
+          <w:color w:val="000000" w:themeColor="text1"/>
+        </w:rPr>
+        <w:t>Zambia  Ministries</w:t>
+      </w:r>
+      <w:proofErr w:type="gramEnd"/>
+      <w:r>
+        <w:rPr>
+          <w:color w:val="000000" w:themeColor="text1"/>
+        </w:rPr>
+        <w:t xml:space="preserve"> and Provincial Administrations:</w:t>
       </w:r>
     </w:p>
     <w:p>
@@ -26474,7 +25981,21 @@
         <w:rPr>
           <w:color w:val="000000" w:themeColor="text1"/>
         </w:rPr>
-        <w:t>PHP official security advisory — 21 October 2026:</w:t>
+        <w:t xml:space="preserve">PHP official security </w:t>
+      </w:r>
+      <w:proofErr w:type="gramStart"/>
+      <w:r>
+        <w:rPr>
+          <w:color w:val="000000" w:themeColor="text1"/>
+        </w:rPr>
+        <w:t>advisory  21</w:t>
+      </w:r>
+      <w:proofErr w:type="gramEnd"/>
+      <w:r>
+        <w:rPr>
+          <w:color w:val="000000" w:themeColor="text1"/>
+        </w:rPr>
+        <w:t xml:space="preserve"> October 2026:</w:t>
       </w:r>
     </w:p>
     <w:p>
@@ -26573,7 +26094,6 @@
         <w:rPr>
           <w:color w:val="000000" w:themeColor="text1"/>
         </w:rPr>
-        <w:lastRenderedPageBreak/>
         <w:t>W3C Web Content Accessibility Guidelines (WCAG) 2.2:</w:t>
       </w:r>
     </w:p>
@@ -26607,7 +26127,7 @@
 </file>
 
 <file path=word/numbering.xml><?xml version="1.0" encoding="utf-8"?>
-<w:numbering xmlns:wpc="http://schemas.microsoft.com/office/word/2010/wordprocessingCanvas" xmlns:cx="http://schemas.microsoft.com/office/drawing/2014/chartex" xmlns:mc="http://schemas.openxmlformats.org/markup-compatibility/2006" xmlns:o="urn:schemas-microsoft-com:office:office" xmlns:r="http://schemas.openxmlformats.org/officeDocument/2006/relationships" xmlns:m="http://schemas.openxmlformats.org/officeDocument/2006/math" xmlns:v="urn:schemas-microsoft-com:vml" xmlns:wp14="http://schemas.microsoft.com/office/word/2010/wordprocessingDrawing" xmlns:wp="http://schemas.openxmlformats.org/drawingml/2006/wordprocessingDrawing" xmlns:w10="urn:schemas-microsoft-com:office:word" xmlns:w="http://schemas.openxmlformats.org/wordprocessingml/2006/main" xmlns:w14="http://schemas.microsoft.com/office/word/2010/wordml" xmlns:w15="http://schemas.microsoft.com/office/word/2012/wordml" xmlns:w16se="http://schemas.microsoft.com/office/word/2015/wordml/symex" xmlns:wpg="http://schemas.microsoft.com/office/word/2010/wordprocessingGroup" xmlns:wpi="http://schemas.microsoft.com/office/word/2010/wordprocessingInk" xmlns:wne="http://schemas.microsoft.com/office/word/2006/wordml" xmlns:wps="http://schemas.microsoft.com/office/word/2010/wordprocessingShape" mc:Ignorable="w14 w15 w16se wp14">
+<w:numbering xmlns:wpc="http://schemas.microsoft.com/office/word/2010/wordprocessingCanvas" xmlns:cx="http://schemas.microsoft.com/office/drawing/2014/chartex" xmlns:cx1="http://schemas.microsoft.com/office/drawing/2015/9/8/chartex" xmlns:cx2="http://schemas.microsoft.com/office/drawing/2015/10/21/chartex" xmlns:cx3="http://schemas.microsoft.com/office/drawing/2016/5/9/chartex" xmlns:cx4="http://schemas.microsoft.com/office/drawing/2016/5/10/chartex" xmlns:cx5="http://schemas.microsoft.com/office/drawing/2016/5/11/chartex" xmlns:cx6="http://schemas.microsoft.com/office/drawing/2016/5/12/chartex" xmlns:cx7="http://schemas.microsoft.com/office/drawing/2016/5/13/chartex" xmlns:cx8="http://schemas.microsoft.com/office/drawing/2016/5/14/chartex" xmlns:mc="http://schemas.openxmlformats.org/markup-compatibility/2006" xmlns:aink="http://schemas.microsoft.com/office/drawing/2016/ink" xmlns:am3d="http://schemas.microsoft.com/office/drawing/2017/model3d" xmlns:o="urn:schemas-microsoft-com:office:office" xmlns:oel="http://schemas.microsoft.com/office/2019/extlst" xmlns:r="http://schemas.openxmlformats.org/officeDocument/2006/relationships" xmlns:m="http://schemas.openxmlformats.org/officeDocument/2006/math" xmlns:v="urn:schemas-microsoft-com:vml" xmlns:wp14="http://schemas.microsoft.com/office/word/2010/wordprocessingDrawing" xmlns:wp="http://schemas.openxmlformats.org/drawingml/2006/wordprocessingDrawing" xmlns:w10="urn:schemas-microsoft-com:office:word" xmlns:w="http://schemas.openxmlformats.org/wordprocessingml/2006/main" xmlns:w14="http://schemas.microsoft.com/office/word/2010/wordml" xmlns:w15="http://schemas.microsoft.com/office/word/2012/wordml" xmlns:w16cex="http://schemas.microsoft.com/office/word/2018/wordml/cex" xmlns:w16cid="http://schemas.microsoft.com/office/word/2016/wordml/cid" xmlns:w16="http://schemas.microsoft.com/office/word/2018/wordml" xmlns:w16du="http://schemas.microsoft.com/office/word/2023/wordml/word16du" xmlns:w16sdtdh="http://schemas.microsoft.com/office/word/2020/wordml/sdtdatahash" xmlns:w16se="http://schemas.microsoft.com/office/word/2015/wordml/symex" xmlns:wpg="http://schemas.microsoft.com/office/word/2010/wordprocessingGroup" xmlns:wpi="http://schemas.microsoft.com/office/word/2010/wordprocessingInk" xmlns:wne="http://schemas.microsoft.com/office/word/2006/wordml" xmlns:wps="http://schemas.microsoft.com/office/word/2010/wordprocessingShape" mc:Ignorable="w14 w15 w16se w16cid w16 w16cex w16sdtdh wp14">
   <w:abstractNum w:abstractNumId="0" w15:restartNumberingAfterBreak="0">
     <w:nsid w:val="3DDF4BD1"/>
     <w:multiLevelType w:val="hybridMultilevel"/>
@@ -26694,7 +26214,7 @@
       </w:pPr>
     </w:lvl>
   </w:abstractNum>
-  <w:num w:numId="1">
+  <w:num w:numId="1" w16cid:durableId="1390957206">
     <w:abstractNumId w:val="0"/>
     <w:lvlOverride w:ilvl="0">
       <w:startOverride w:val="1"/>
@@ -26704,7 +26224,7 @@
 </file>
 
 <file path=word/styles.xml><?xml version="1.0" encoding="utf-8"?>
-<w:styles xmlns:mc="http://schemas.openxmlformats.org/markup-compatibility/2006" xmlns:r="http://schemas.openxmlformats.org/officeDocument/2006/relationships" xmlns:w="http://schemas.openxmlformats.org/wordprocessingml/2006/main" xmlns:w14="http://schemas.microsoft.com/office/word/2010/wordml" xmlns:w15="http://schemas.microsoft.com/office/word/2012/wordml" xmlns:w16se="http://schemas.microsoft.com/office/word/2015/wordml/symex" mc:Ignorable="w14 w15 w16se">
+<w:styles xmlns:mc="http://schemas.openxmlformats.org/markup-compatibility/2006" xmlns:r="http://schemas.openxmlformats.org/officeDocument/2006/relationships" xmlns:w="http://schemas.openxmlformats.org/wordprocessingml/2006/main" xmlns:w14="http://schemas.microsoft.com/office/word/2010/wordml" xmlns:w15="http://schemas.microsoft.com/office/word/2012/wordml" xmlns:w16cex="http://schemas.microsoft.com/office/word/2018/wordml/cex" xmlns:w16cid="http://schemas.microsoft.com/office/word/2016/wordml/cid" xmlns:w16="http://schemas.microsoft.com/office/word/2018/wordml" xmlns:w16sdtdh="http://schemas.microsoft.com/office/word/2020/wordml/sdtdatahash" xmlns:w16se="http://schemas.microsoft.com/office/word/2015/wordml/symex" mc:Ignorable="w14 w15 w16se w16cid w16 w16cex w16sdtdh">
   <w:docDefaults>
     <w:rPrDefault>
       <w:rPr>
@@ -26714,7 +26234,7 @@
     </w:rPrDefault>
     <w:pPrDefault/>
   </w:docDefaults>
-  <w:latentStyles w:defLockedState="0" w:defUIPriority="99" w:defSemiHidden="0" w:defUnhideWhenUsed="0" w:defQFormat="0" w:count="371">
+  <w:latentStyles w:defLockedState="0" w:defUIPriority="99" w:defSemiHidden="0" w:defUnhideWhenUsed="0" w:defQFormat="0" w:count="376">
     <w:lsdException w:name="Normal" w:uiPriority="0" w:qFormat="1"/>
     <w:lsdException w:name="heading 1" w:uiPriority="9" w:qFormat="1"/>
     <w:lsdException w:name="heading 2" w:semiHidden="1" w:uiPriority="9" w:unhideWhenUsed="1" w:qFormat="1"/>
@@ -26820,7 +26340,6 @@
     <w:lsdException w:name="HTML Sample" w:semiHidden="1" w:unhideWhenUsed="1"/>
     <w:lsdException w:name="HTML Typewriter" w:semiHidden="1" w:unhideWhenUsed="1"/>
     <w:lsdException w:name="HTML Variable" w:semiHidden="1" w:unhideWhenUsed="1"/>
-    <w:lsdException w:name="Normal Table" w:semiHidden="1" w:unhideWhenUsed="1"/>
     <w:lsdException w:name="annotation subject" w:semiHidden="1" w:unhideWhenUsed="1"/>
     <w:lsdException w:name="No List" w:semiHidden="1" w:unhideWhenUsed="1"/>
     <w:lsdException w:name="Outline List 1" w:semiHidden="1" w:unhideWhenUsed="1"/>
@@ -26863,11 +26382,8 @@
     <w:lsdException w:name="Table Contemporary" w:semiHidden="1" w:unhideWhenUsed="1"/>
     <w:lsdException w:name="Table Elegant" w:semiHidden="1" w:unhideWhenUsed="1"/>
     <w:lsdException w:name="Table Professional" w:semiHidden="1" w:unhideWhenUsed="1"/>
-    <w:lsdException w:name="Table Subtle 1" w:semiHidden="1" w:unhideWhenUsed="1"/>
     <w:lsdException w:name="Table Subtle 2" w:semiHidden="1" w:unhideWhenUsed="1"/>
     <w:lsdException w:name="Table Web 1" w:semiHidden="1" w:unhideWhenUsed="1"/>
-    <w:lsdException w:name="Table Web 2" w:semiHidden="1" w:unhideWhenUsed="1"/>
-    <w:lsdException w:name="Table Web 3" w:semiHidden="1" w:unhideWhenUsed="1"/>
     <w:lsdException w:name="Balloon Text" w:semiHidden="1" w:unhideWhenUsed="1"/>
     <w:lsdException w:name="Table Grid" w:uiPriority="39"/>
     <w:lsdException w:name="Table Theme" w:semiHidden="1" w:unhideWhenUsed="1"/>
@@ -27086,6 +26602,11 @@
     <w:lsdException w:name="List Table 5 Dark Accent 6" w:uiPriority="50"/>
     <w:lsdException w:name="List Table 6 Colorful Accent 6" w:uiPriority="51"/>
     <w:lsdException w:name="List Table 7 Colorful Accent 6" w:uiPriority="52"/>
+    <w:lsdException w:name="Mention" w:semiHidden="1" w:unhideWhenUsed="1"/>
+    <w:lsdException w:name="Smart Hyperlink" w:semiHidden="1" w:unhideWhenUsed="1"/>
+    <w:lsdException w:name="Hashtag" w:semiHidden="1" w:unhideWhenUsed="1"/>
+    <w:lsdException w:name="Unresolved Mention" w:semiHidden="1" w:unhideWhenUsed="1"/>
+    <w:lsdException w:name="Smart Link" w:semiHidden="1" w:unhideWhenUsed="1"/>
   </w:latentStyles>
   <w:style w:type="paragraph" w:default="1" w:styleId="Normal">
     <w:name w:val="Normal"/>
@@ -27310,7 +26831,6 @@
     <w:name w:val="Normal (Web)"/>
     <w:basedOn w:val="Normal"/>
     <w:uiPriority w:val="99"/>
-    <w:semiHidden/>
     <w:unhideWhenUsed/>
     <w:rsid w:val="008D6991"/>
     <w:pPr>

</xml_diff>